<commit_message>
docs: refresh report — gap table + §5.4 reflect the implemented rebuild backend
Updates the gap analysis so the Type-2 items now read "implemented (backend)"
— Audit Universe + Annual Plan, Engagements + workpaper lifecycle, data
validation, RBAC, append-only audit trail, external-auditor/PBC portal, evidence
+ committee report, encrypted backup — leaving only PDPL data-residency and the
FastAPI/Postgres migration as remaining. Adds section 5.4 documenting the working,
tested (62 checks) standard-library backend under my_audit_enterprise/backend/.
Regenerated both .docx and .pdf.

Co-Authored-By: Claude Opus 4.8 <noreply@anthropic.com>
Claude-Session: https://claude.ai/code/session_01VHeZ5YeuXGETnZSWTsMSiV
</commit_message>
<xml_diff>
--- a/my_audit_enterprise/docs/تقرير_تطوير_المنصة.docx
+++ b/my_audit_enterprise/docs/تقرير_تطوير_المنصة.docx
@@ -887,7 +887,7 @@
           <w:rFonts w:ascii="Arial" w:cs="Arial" w:eastAsia="Arial" w:hAnsi="Arial"/>
           <w:rtl/>
         </w:rPr>
-        <w:t xml:space="preserve">يوضّح الجدول حالة كل فجوة بعد تنفيذ وحدات النوع الأول:</w:t>
+        <w:t xml:space="preserve">يوضّح الجدول حالة كل فجوة بعد تنفيذ وحدات النوع الأول (في الواجهة) وأساس النوع الثاني (في الخادم):</w:t>
       </w:r>
     </w:p>
     <w:tbl>
@@ -1621,7 +1621,7 @@
                 <w:szCs w:val="19"/>
                 <w:rtl/>
               </w:rPr>
-              <w:t xml:space="preserve">خطة مراجعة سنوية مبنية على المخاطر</w:t>
+              <w:t xml:space="preserve">سجل الأنشطة (Audit Universe) + الخطة السنوية</w:t>
             </w:r>
           </w:p>
         </w:tc>
@@ -1649,7 +1649,7 @@
                 <w:szCs w:val="19"/>
                 <w:rtl/>
               </w:rPr>
-              <w:t xml:space="preserve">متوسطة</w:t>
+              <w:t xml:space="preserve">عالية</w:t>
             </w:r>
           </w:p>
         </w:tc>
@@ -1677,7 +1677,7 @@
                 <w:szCs w:val="19"/>
                 <w:rtl/>
               </w:rPr>
-              <w:t xml:space="preserve">أساسها متوفر عبر ترتيب سجل المخاطر</w:t>
+              <w:t xml:space="preserve">مُنفَّذة ✔ (backend)</w:t>
             </w:r>
           </w:p>
         </w:tc>
@@ -1705,7 +1705,7 @@
                 <w:szCs w:val="19"/>
                 <w:rtl/>
               </w:rPr>
-              <w:t xml:space="preserve">أول</w:t>
+              <w:t xml:space="preserve">ثانٍ</w:t>
             </w:r>
           </w:p>
         </w:tc>
@@ -1734,7 +1734,7 @@
                 <w:szCs w:val="19"/>
                 <w:rtl/>
               </w:rPr>
-              <w:t xml:space="preserve">صلاحيات المستخدمين (RBAC) + الفصل الوظيفي</w:t>
+              <w:t xml:space="preserve">ملفات المراجعة + دورة أوراق العمل (إعداد/مراجعة/اعتماد/قفل)</w:t>
             </w:r>
           </w:p>
         </w:tc>
@@ -1761,7 +1761,7 @@
                 <w:szCs w:val="19"/>
                 <w:rtl/>
               </w:rPr>
-              <w:t xml:space="preserve">متوسطة</w:t>
+              <w:t xml:space="preserve">عالية</w:t>
             </w:r>
           </w:p>
         </w:tc>
@@ -1788,7 +1788,7 @@
                 <w:szCs w:val="19"/>
                 <w:rtl/>
               </w:rPr>
-              <w:t xml:space="preserve">قائمة — تتطلب خلفية مخدومة</w:t>
+              <w:t xml:space="preserve">مُنفَّذة ✔ (backend)</w:t>
             </w:r>
           </w:p>
         </w:tc>
@@ -1845,7 +1845,7 @@
                 <w:szCs w:val="19"/>
                 <w:rtl/>
               </w:rPr>
-              <w:t xml:space="preserve">سجل تدقيق غير قابل للتلاعب (Audit Trail)</w:t>
+              <w:t xml:space="preserve">محرّك جودة وتحقق البيانات (SQL rules)</w:t>
             </w:r>
           </w:p>
         </w:tc>
@@ -1901,7 +1901,7 @@
                 <w:szCs w:val="19"/>
                 <w:rtl/>
               </w:rPr>
-              <w:t xml:space="preserve">قائمة — تتطلب خادماً وقاعدة بيانات</w:t>
+              <w:t xml:space="preserve">مُنفَّذة ✔ (backend)</w:t>
             </w:r>
           </w:p>
         </w:tc>
@@ -1958,7 +1958,7 @@
                 <w:szCs w:val="19"/>
                 <w:rtl/>
               </w:rPr>
-              <w:t xml:space="preserve">بوابة المراجع الخارجي + قائمة PBC</w:t>
+              <w:t xml:space="preserve">صلاحيات المستخدمين (RBAC) + الفصل الوظيفي</w:t>
             </w:r>
           </w:p>
         </w:tc>
@@ -1985,7 +1985,7 @@
                 <w:szCs w:val="19"/>
                 <w:rtl/>
               </w:rPr>
-              <w:t xml:space="preserve">عالية</w:t>
+              <w:t xml:space="preserve">متوسطة</w:t>
             </w:r>
           </w:p>
         </w:tc>
@@ -2012,7 +2012,7 @@
                 <w:szCs w:val="19"/>
                 <w:rtl/>
               </w:rPr>
-              <w:t xml:space="preserve">قائمة — تتطلب مستخدمين متعددين</w:t>
+              <w:t xml:space="preserve">مُنفَّذة ✔ (backend)</w:t>
             </w:r>
           </w:p>
         </w:tc>
@@ -2069,7 +2069,7 @@
                 <w:szCs w:val="19"/>
                 <w:rtl/>
               </w:rPr>
-              <w:t xml:space="preserve">النسخ الاحتياطي المشفّر وإقامة البيانات (PDPL)</w:t>
+              <w:t xml:space="preserve">سجل تدقيق غير قابل للتلاعب (Audit Trail)</w:t>
             </w:r>
           </w:p>
         </w:tc>
@@ -2097,6 +2097,342 @@
                 <w:szCs w:val="19"/>
                 <w:rtl/>
               </w:rPr>
+              <w:t xml:space="preserve">عالية</w:t>
+            </w:r>
+          </w:p>
+        </w:tc>
+        <w:tc>
+          <w:tcPr>
+            <w:tcW w:type="dxa" w:w="2400"/>
+            <w:shd w:fill="F1F5F9" w:color="auto" w:val="clear"/>
+            <w:tcMar>
+              <w:top w:type="dxa" w:w="60"/>
+              <w:left w:type="dxa" w:w="80"/>
+              <w:bottom w:type="dxa" w:w="60"/>
+              <w:right w:type="dxa" w:w="80"/>
+            </w:tcMar>
+          </w:tcPr>
+          <w:p>
+            <w:pPr>
+              <w:bidi/>
+              <w:spacing w:after="0" w:line="270"/>
+              <w:jc w:val="right"/>
+            </w:pPr>
+            <w:r>
+              <w:rPr>
+                <w:rFonts w:ascii="Arial" w:cs="Arial" w:eastAsia="Arial" w:hAnsi="Arial"/>
+                <w:sz w:val="19"/>
+                <w:szCs w:val="19"/>
+                <w:rtl/>
+              </w:rPr>
+              <w:t xml:space="preserve">مُنفَّذة ✔ (backend)</w:t>
+            </w:r>
+          </w:p>
+        </w:tc>
+        <w:tc>
+          <w:tcPr>
+            <w:tcW w:type="dxa" w:w="1600"/>
+            <w:shd w:fill="F1F5F9" w:color="auto" w:val="clear"/>
+            <w:tcMar>
+              <w:top w:type="dxa" w:w="60"/>
+              <w:left w:type="dxa" w:w="80"/>
+              <w:bottom w:type="dxa" w:w="60"/>
+              <w:right w:type="dxa" w:w="80"/>
+            </w:tcMar>
+          </w:tcPr>
+          <w:p>
+            <w:pPr>
+              <w:bidi/>
+              <w:spacing w:after="0" w:line="270"/>
+              <w:jc w:val="right"/>
+            </w:pPr>
+            <w:r>
+              <w:rPr>
+                <w:rFonts w:ascii="Arial" w:cs="Arial" w:eastAsia="Arial" w:hAnsi="Arial"/>
+                <w:sz w:val="19"/>
+                <w:szCs w:val="19"/>
+                <w:rtl/>
+              </w:rPr>
+              <w:t xml:space="preserve">ثانٍ</w:t>
+            </w:r>
+          </w:p>
+        </w:tc>
+      </w:tr>
+      <w:tr>
+        <w:tc>
+          <w:tcPr>
+            <w:tcW w:type="dxa" w:w="3400"/>
+            <w:tcMar>
+              <w:top w:type="dxa" w:w="60"/>
+              <w:left w:type="dxa" w:w="80"/>
+              <w:bottom w:type="dxa" w:w="60"/>
+              <w:right w:type="dxa" w:w="80"/>
+            </w:tcMar>
+          </w:tcPr>
+          <w:p>
+            <w:pPr>
+              <w:bidi/>
+              <w:spacing w:after="0" w:line="270"/>
+              <w:jc w:val="right"/>
+            </w:pPr>
+            <w:r>
+              <w:rPr>
+                <w:rFonts w:ascii="Arial" w:cs="Arial" w:eastAsia="Arial" w:hAnsi="Arial"/>
+                <w:sz w:val="19"/>
+                <w:szCs w:val="19"/>
+                <w:rtl/>
+              </w:rPr>
+              <w:t xml:space="preserve">بوابة المراجع الخارجي + قائمة PBC</w:t>
+            </w:r>
+          </w:p>
+        </w:tc>
+        <w:tc>
+          <w:tcPr>
+            <w:tcW w:type="dxa" w:w="1600"/>
+            <w:tcMar>
+              <w:top w:type="dxa" w:w="60"/>
+              <w:left w:type="dxa" w:w="80"/>
+              <w:bottom w:type="dxa" w:w="60"/>
+              <w:right w:type="dxa" w:w="80"/>
+            </w:tcMar>
+          </w:tcPr>
+          <w:p>
+            <w:pPr>
+              <w:bidi/>
+              <w:spacing w:after="0" w:line="270"/>
+              <w:jc w:val="right"/>
+            </w:pPr>
+            <w:r>
+              <w:rPr>
+                <w:rFonts w:ascii="Arial" w:cs="Arial" w:eastAsia="Arial" w:hAnsi="Arial"/>
+                <w:sz w:val="19"/>
+                <w:szCs w:val="19"/>
+                <w:rtl/>
+              </w:rPr>
+              <w:t xml:space="preserve">عالية</w:t>
+            </w:r>
+          </w:p>
+        </w:tc>
+        <w:tc>
+          <w:tcPr>
+            <w:tcW w:type="dxa" w:w="2400"/>
+            <w:tcMar>
+              <w:top w:type="dxa" w:w="60"/>
+              <w:left w:type="dxa" w:w="80"/>
+              <w:bottom w:type="dxa" w:w="60"/>
+              <w:right w:type="dxa" w:w="80"/>
+            </w:tcMar>
+          </w:tcPr>
+          <w:p>
+            <w:pPr>
+              <w:bidi/>
+              <w:spacing w:after="0" w:line="270"/>
+              <w:jc w:val="right"/>
+            </w:pPr>
+            <w:r>
+              <w:rPr>
+                <w:rFonts w:ascii="Arial" w:cs="Arial" w:eastAsia="Arial" w:hAnsi="Arial"/>
+                <w:sz w:val="19"/>
+                <w:szCs w:val="19"/>
+                <w:rtl/>
+              </w:rPr>
+              <w:t xml:space="preserve">مُنفَّذة ✔ (backend)</w:t>
+            </w:r>
+          </w:p>
+        </w:tc>
+        <w:tc>
+          <w:tcPr>
+            <w:tcW w:type="dxa" w:w="1600"/>
+            <w:tcMar>
+              <w:top w:type="dxa" w:w="60"/>
+              <w:left w:type="dxa" w:w="80"/>
+              <w:bottom w:type="dxa" w:w="60"/>
+              <w:right w:type="dxa" w:w="80"/>
+            </w:tcMar>
+          </w:tcPr>
+          <w:p>
+            <w:pPr>
+              <w:bidi/>
+              <w:spacing w:after="0" w:line="270"/>
+              <w:jc w:val="right"/>
+            </w:pPr>
+            <w:r>
+              <w:rPr>
+                <w:rFonts w:ascii="Arial" w:cs="Arial" w:eastAsia="Arial" w:hAnsi="Arial"/>
+                <w:sz w:val="19"/>
+                <w:szCs w:val="19"/>
+                <w:rtl/>
+              </w:rPr>
+              <w:t xml:space="preserve">ثانٍ</w:t>
+            </w:r>
+          </w:p>
+        </w:tc>
+      </w:tr>
+      <w:tr>
+        <w:tc>
+          <w:tcPr>
+            <w:tcW w:type="dxa" w:w="3400"/>
+            <w:shd w:fill="F1F5F9" w:color="auto" w:val="clear"/>
+            <w:tcMar>
+              <w:top w:type="dxa" w:w="60"/>
+              <w:left w:type="dxa" w:w="80"/>
+              <w:bottom w:type="dxa" w:w="60"/>
+              <w:right w:type="dxa" w:w="80"/>
+            </w:tcMar>
+          </w:tcPr>
+          <w:p>
+            <w:pPr>
+              <w:bidi/>
+              <w:spacing w:after="0" w:line="270"/>
+              <w:jc w:val="right"/>
+            </w:pPr>
+            <w:r>
+              <w:rPr>
+                <w:rFonts w:ascii="Arial" w:cs="Arial" w:eastAsia="Arial" w:hAnsi="Arial"/>
+                <w:sz w:val="19"/>
+                <w:szCs w:val="19"/>
+                <w:rtl/>
+              </w:rPr>
+              <w:t xml:space="preserve">إدارة الأدلة بالبصمة + تقرير لجنة المراجعة</w:t>
+            </w:r>
+          </w:p>
+        </w:tc>
+        <w:tc>
+          <w:tcPr>
+            <w:tcW w:type="dxa" w:w="1600"/>
+            <w:shd w:fill="F1F5F9" w:color="auto" w:val="clear"/>
+            <w:tcMar>
+              <w:top w:type="dxa" w:w="60"/>
+              <w:left w:type="dxa" w:w="80"/>
+              <w:bottom w:type="dxa" w:w="60"/>
+              <w:right w:type="dxa" w:w="80"/>
+            </w:tcMar>
+          </w:tcPr>
+          <w:p>
+            <w:pPr>
+              <w:bidi/>
+              <w:spacing w:after="0" w:line="270"/>
+              <w:jc w:val="right"/>
+            </w:pPr>
+            <w:r>
+              <w:rPr>
+                <w:rFonts w:ascii="Arial" w:cs="Arial" w:eastAsia="Arial" w:hAnsi="Arial"/>
+                <w:sz w:val="19"/>
+                <w:szCs w:val="19"/>
+                <w:rtl/>
+              </w:rPr>
+              <w:t xml:space="preserve">عالية</w:t>
+            </w:r>
+          </w:p>
+        </w:tc>
+        <w:tc>
+          <w:tcPr>
+            <w:tcW w:type="dxa" w:w="2400"/>
+            <w:shd w:fill="F1F5F9" w:color="auto" w:val="clear"/>
+            <w:tcMar>
+              <w:top w:type="dxa" w:w="60"/>
+              <w:left w:type="dxa" w:w="80"/>
+              <w:bottom w:type="dxa" w:w="60"/>
+              <w:right w:type="dxa" w:w="80"/>
+            </w:tcMar>
+          </w:tcPr>
+          <w:p>
+            <w:pPr>
+              <w:bidi/>
+              <w:spacing w:after="0" w:line="270"/>
+              <w:jc w:val="right"/>
+            </w:pPr>
+            <w:r>
+              <w:rPr>
+                <w:rFonts w:ascii="Arial" w:cs="Arial" w:eastAsia="Arial" w:hAnsi="Arial"/>
+                <w:sz w:val="19"/>
+                <w:szCs w:val="19"/>
+                <w:rtl/>
+              </w:rPr>
+              <w:t xml:space="preserve">مُنفَّذة ✔ (backend)</w:t>
+            </w:r>
+          </w:p>
+        </w:tc>
+        <w:tc>
+          <w:tcPr>
+            <w:tcW w:type="dxa" w:w="1600"/>
+            <w:shd w:fill="F1F5F9" w:color="auto" w:val="clear"/>
+            <w:tcMar>
+              <w:top w:type="dxa" w:w="60"/>
+              <w:left w:type="dxa" w:w="80"/>
+              <w:bottom w:type="dxa" w:w="60"/>
+              <w:right w:type="dxa" w:w="80"/>
+            </w:tcMar>
+          </w:tcPr>
+          <w:p>
+            <w:pPr>
+              <w:bidi/>
+              <w:spacing w:after="0" w:line="270"/>
+              <w:jc w:val="right"/>
+            </w:pPr>
+            <w:r>
+              <w:rPr>
+                <w:rFonts w:ascii="Arial" w:cs="Arial" w:eastAsia="Arial" w:hAnsi="Arial"/>
+                <w:sz w:val="19"/>
+                <w:szCs w:val="19"/>
+                <w:rtl/>
+              </w:rPr>
+              <w:t xml:space="preserve">ثانٍ</w:t>
+            </w:r>
+          </w:p>
+        </w:tc>
+      </w:tr>
+      <w:tr>
+        <w:tc>
+          <w:tcPr>
+            <w:tcW w:type="dxa" w:w="3400"/>
+            <w:tcMar>
+              <w:top w:type="dxa" w:w="60"/>
+              <w:left w:type="dxa" w:w="80"/>
+              <w:bottom w:type="dxa" w:w="60"/>
+              <w:right w:type="dxa" w:w="80"/>
+            </w:tcMar>
+          </w:tcPr>
+          <w:p>
+            <w:pPr>
+              <w:bidi/>
+              <w:spacing w:after="0" w:line="270"/>
+              <w:jc w:val="right"/>
+            </w:pPr>
+            <w:r>
+              <w:rPr>
+                <w:rFonts w:ascii="Arial" w:cs="Arial" w:eastAsia="Arial" w:hAnsi="Arial"/>
+                <w:sz w:val="19"/>
+                <w:szCs w:val="19"/>
+                <w:rtl/>
+              </w:rPr>
+              <w:t xml:space="preserve">النسخ الاحتياطي المشفّر</w:t>
+            </w:r>
+          </w:p>
+        </w:tc>
+        <w:tc>
+          <w:tcPr>
+            <w:tcW w:type="dxa" w:w="1600"/>
+            <w:tcMar>
+              <w:top w:type="dxa" w:w="60"/>
+              <w:left w:type="dxa" w:w="80"/>
+              <w:bottom w:type="dxa" w:w="60"/>
+              <w:right w:type="dxa" w:w="80"/>
+            </w:tcMar>
+          </w:tcPr>
+          <w:p>
+            <w:pPr>
+              <w:bidi/>
+              <w:spacing w:after="0" w:line="270"/>
+              <w:jc w:val="right"/>
+            </w:pPr>
+            <w:r>
+              <w:rPr>
+                <w:rFonts w:ascii="Arial" w:cs="Arial" w:eastAsia="Arial" w:hAnsi="Arial"/>
+                <w:sz w:val="19"/>
+                <w:szCs w:val="19"/>
+                <w:rtl/>
+              </w:rPr>
               <w:t xml:space="preserve">متوسطة</w:t>
             </w:r>
           </w:p>
@@ -2104,28 +2440,140 @@
         <w:tc>
           <w:tcPr>
             <w:tcW w:type="dxa" w:w="2400"/>
-            <w:shd w:fill="F1F5F9" w:color="auto" w:val="clear"/>
-            <w:tcMar>
-              <w:top w:type="dxa" w:w="60"/>
-              <w:left w:type="dxa" w:w="80"/>
-              <w:bottom w:type="dxa" w:w="60"/>
-              <w:right w:type="dxa" w:w="80"/>
-            </w:tcMar>
-          </w:tcPr>
-          <w:p>
-            <w:pPr>
-              <w:bidi/>
-              <w:spacing w:after="0" w:line="270"/>
-              <w:jc w:val="right"/>
-            </w:pPr>
-            <w:r>
-              <w:rPr>
-                <w:rFonts w:ascii="Arial" w:cs="Arial" w:eastAsia="Arial" w:hAnsi="Arial"/>
-                <w:sz w:val="19"/>
-                <w:szCs w:val="19"/>
-                <w:rtl/>
-              </w:rPr>
-              <w:t xml:space="preserve">قائمة — بنية تحتية</w:t>
+            <w:tcMar>
+              <w:top w:type="dxa" w:w="60"/>
+              <w:left w:type="dxa" w:w="80"/>
+              <w:bottom w:type="dxa" w:w="60"/>
+              <w:right w:type="dxa" w:w="80"/>
+            </w:tcMar>
+          </w:tcPr>
+          <w:p>
+            <w:pPr>
+              <w:bidi/>
+              <w:spacing w:after="0" w:line="270"/>
+              <w:jc w:val="right"/>
+            </w:pPr>
+            <w:r>
+              <w:rPr>
+                <w:rFonts w:ascii="Arial" w:cs="Arial" w:eastAsia="Arial" w:hAnsi="Arial"/>
+                <w:sz w:val="19"/>
+                <w:szCs w:val="19"/>
+                <w:rtl/>
+              </w:rPr>
+              <w:t xml:space="preserve">مُنفَّذة ✔ (backend)</w:t>
+            </w:r>
+          </w:p>
+        </w:tc>
+        <w:tc>
+          <w:tcPr>
+            <w:tcW w:type="dxa" w:w="1600"/>
+            <w:tcMar>
+              <w:top w:type="dxa" w:w="60"/>
+              <w:left w:type="dxa" w:w="80"/>
+              <w:bottom w:type="dxa" w:w="60"/>
+              <w:right w:type="dxa" w:w="80"/>
+            </w:tcMar>
+          </w:tcPr>
+          <w:p>
+            <w:pPr>
+              <w:bidi/>
+              <w:spacing w:after="0" w:line="270"/>
+              <w:jc w:val="right"/>
+            </w:pPr>
+            <w:r>
+              <w:rPr>
+                <w:rFonts w:ascii="Arial" w:cs="Arial" w:eastAsia="Arial" w:hAnsi="Arial"/>
+                <w:sz w:val="19"/>
+                <w:szCs w:val="19"/>
+                <w:rtl/>
+              </w:rPr>
+              <w:t xml:space="preserve">ثانٍ</w:t>
+            </w:r>
+          </w:p>
+        </w:tc>
+      </w:tr>
+      <w:tr>
+        <w:tc>
+          <w:tcPr>
+            <w:tcW w:type="dxa" w:w="3400"/>
+            <w:shd w:fill="F1F5F9" w:color="auto" w:val="clear"/>
+            <w:tcMar>
+              <w:top w:type="dxa" w:w="60"/>
+              <w:left w:type="dxa" w:w="80"/>
+              <w:bottom w:type="dxa" w:w="60"/>
+              <w:right w:type="dxa" w:w="80"/>
+            </w:tcMar>
+          </w:tcPr>
+          <w:p>
+            <w:pPr>
+              <w:bidi/>
+              <w:spacing w:after="0" w:line="270"/>
+              <w:jc w:val="right"/>
+            </w:pPr>
+            <w:r>
+              <w:rPr>
+                <w:rFonts w:ascii="Arial" w:cs="Arial" w:eastAsia="Arial" w:hAnsi="Arial"/>
+                <w:sz w:val="19"/>
+                <w:szCs w:val="19"/>
+                <w:rtl/>
+              </w:rPr>
+              <w:t xml:space="preserve">إقامة البيانات (PDPL) + الترحيل إلى FastAPI/Postgres</w:t>
+            </w:r>
+          </w:p>
+        </w:tc>
+        <w:tc>
+          <w:tcPr>
+            <w:tcW w:type="dxa" w:w="1600"/>
+            <w:shd w:fill="F1F5F9" w:color="auto" w:val="clear"/>
+            <w:tcMar>
+              <w:top w:type="dxa" w:w="60"/>
+              <w:left w:type="dxa" w:w="80"/>
+              <w:bottom w:type="dxa" w:w="60"/>
+              <w:right w:type="dxa" w:w="80"/>
+            </w:tcMar>
+          </w:tcPr>
+          <w:p>
+            <w:pPr>
+              <w:bidi/>
+              <w:spacing w:after="0" w:line="270"/>
+              <w:jc w:val="right"/>
+            </w:pPr>
+            <w:r>
+              <w:rPr>
+                <w:rFonts w:ascii="Arial" w:cs="Arial" w:eastAsia="Arial" w:hAnsi="Arial"/>
+                <w:sz w:val="19"/>
+                <w:szCs w:val="19"/>
+                <w:rtl/>
+              </w:rPr>
+              <w:t xml:space="preserve">متوسطة</w:t>
+            </w:r>
+          </w:p>
+        </w:tc>
+        <w:tc>
+          <w:tcPr>
+            <w:tcW w:type="dxa" w:w="2400"/>
+            <w:shd w:fill="F1F5F9" w:color="auto" w:val="clear"/>
+            <w:tcMar>
+              <w:top w:type="dxa" w:w="60"/>
+              <w:left w:type="dxa" w:w="80"/>
+              <w:bottom w:type="dxa" w:w="60"/>
+              <w:right w:type="dxa" w:w="80"/>
+            </w:tcMar>
+          </w:tcPr>
+          <w:p>
+            <w:pPr>
+              <w:bidi/>
+              <w:spacing w:after="0" w:line="270"/>
+              <w:jc w:val="right"/>
+            </w:pPr>
+            <w:r>
+              <w:rPr>
+                <w:rFonts w:ascii="Arial" w:cs="Arial" w:eastAsia="Arial" w:hAnsi="Arial"/>
+                <w:sz w:val="19"/>
+                <w:szCs w:val="19"/>
+                <w:rtl/>
+              </w:rPr>
+              <w:t xml:space="preserve">قائمة — بنية تحتية/توسّع</w:t>
             </w:r>
           </w:p>
         </w:tc>
@@ -3342,6 +3790,149 @@
           <w:rtl/>
         </w:rPr>
         <w:t xml:space="preserve">التقديرات مبدئية وتُضبط بعد ورشة تحديد نطاق مع الفريق. يمكن إبقاء المنصة الحالية عاملة أثناء البناء التدريجي للخلفية.</w:t>
+      </w:r>
+    </w:p>
+    <w:p>
+      <w:pPr>
+        <w:pStyle w:val="Heading2"/>
+        <w:bidi/>
+        <w:spacing w:after="120" w:before="240"/>
+        <w:jc w:val="right"/>
+      </w:pPr>
+      <w:r>
+        <w:rPr>
+          <w:rFonts w:ascii="Arial" w:cs="Arial" w:eastAsia="Arial" w:hAnsi="Arial"/>
+          <w:b/>
+          <w:bCs/>
+          <w:color w:val="1E3A5F"/>
+          <w:rtl/>
+        </w:rPr>
+        <w:t xml:space="preserve">5.4 المُنفَّذ فعلاً من إعادة البناء (أساس عامل ومُختبَر)</w:t>
+      </w:r>
+    </w:p>
+    <w:p>
+      <w:pPr>
+        <w:bidi/>
+        <w:spacing w:after="120" w:line="300"/>
+        <w:jc w:val="right"/>
+      </w:pPr>
+      <w:r>
+        <w:rPr>
+          <w:rFonts w:ascii="Arial" w:cs="Arial" w:eastAsia="Arial" w:hAnsi="Arial"/>
+          <w:rtl/>
+        </w:rPr>
+        <w:t xml:space="preserve">تم بالفعل بناء أساس النوع الثاني كخادم عامل بمكتبة بايثون القياسية + SQLite (بلا تبعيات) تحت </w:t>
+      </w:r>
+      <w:r>
+        <w:rPr>
+          <w:rFonts w:ascii="Arial" w:cs="Arial" w:eastAsia="Arial" w:hAnsi="Arial"/>
+          <w:b/>
+          <w:bCs/>
+          <w:rtl/>
+        </w:rPr>
+        <w:t xml:space="preserve">my_audit_enterprise/backend/</w:t>
+      </w:r>
+      <w:r>
+        <w:rPr>
+          <w:rFonts w:ascii="Arial" w:cs="Arial" w:eastAsia="Arial" w:hAnsi="Arial"/>
+          <w:rtl/>
+        </w:rPr>
+        <w:t xml:space="preserve">، مع ٦٢ اختباراً آلياً ناجحاً. يبقى FastAPI + PostgreSQL كمسار توسّع، وعقد الـ HTTP/JSON مستقل عن الإطار فلا يتغيّر النموذج.</w:t>
+      </w:r>
+    </w:p>
+    <w:p>
+      <w:pPr>
+        <w:pStyle w:val="ListParagraph"/>
+        <w:numPr>
+          <w:ilvl w:val="0"/>
+          <w:numId w:val="1"/>
+        </w:numPr>
+        <w:bidi/>
+        <w:spacing w:after="60" w:line="290"/>
+        <w:jc w:val="right"/>
+      </w:pPr>
+      <w:r>
+        <w:rPr>
+          <w:rFonts w:ascii="Arial" w:cs="Arial" w:eastAsia="Arial" w:hAnsi="Arial"/>
+          <w:rtl/>
+        </w:rPr>
+        <w:t xml:space="preserve">مصادقة بحسابات مستخدمين (PBKDF2)، وجلسات بكوكي httpOnly، وصلاحيات RBAC لخمسة أدوار على كل نقطة تعديل.</w:t>
+      </w:r>
+    </w:p>
+    <w:p>
+      <w:pPr>
+        <w:pStyle w:val="ListParagraph"/>
+        <w:numPr>
+          <w:ilvl w:val="0"/>
+          <w:numId w:val="1"/>
+        </w:numPr>
+        <w:bidi/>
+        <w:spacing w:after="60" w:line="290"/>
+        <w:jc w:val="right"/>
+      </w:pPr>
+      <w:r>
+        <w:rPr>
+          <w:rFonts w:ascii="Arial" w:cs="Arial" w:eastAsia="Arial" w:hAnsi="Arial"/>
+          <w:rtl/>
+        </w:rPr>
+        <w:t xml:space="preserve">سجل تدقيق Append-only (من/متى/ماذا/قبل/بعد) لا مسار لتعديله أو حذفه، والفصل الوظيفي (SoD) على إغلاق الملاحظات وعلى مراجعة/اعتماد أوراق العمل.</w:t>
+      </w:r>
+    </w:p>
+    <w:p>
+      <w:pPr>
+        <w:pStyle w:val="ListParagraph"/>
+        <w:numPr>
+          <w:ilvl w:val="0"/>
+          <w:numId w:val="1"/>
+        </w:numPr>
+        <w:bidi/>
+        <w:spacing w:after="60" w:line="290"/>
+        <w:jc w:val="right"/>
+      </w:pPr>
+      <w:r>
+        <w:rPr>
+          <w:rFonts w:ascii="Arial" w:cs="Arial" w:eastAsia="Arial" w:hAnsi="Arial"/>
+          <w:rtl/>
+        </w:rPr>
+        <w:t xml:space="preserve">حفظ المخاطر/الضوابط/الملاحظات على الخادم، وإدارة الأدلة ببصمة SHA‑256 والتحقق من سلامتها، وتقرير لجنة المراجعة التجميعي.</w:t>
+      </w:r>
+    </w:p>
+    <w:p>
+      <w:pPr>
+        <w:pStyle w:val="ListParagraph"/>
+        <w:numPr>
+          <w:ilvl w:val="0"/>
+          <w:numId w:val="1"/>
+        </w:numPr>
+        <w:bidi/>
+        <w:spacing w:after="60" w:line="290"/>
+        <w:jc w:val="right"/>
+      </w:pPr>
+      <w:r>
+        <w:rPr>
+          <w:rFonts w:ascii="Arial" w:cs="Arial" w:eastAsia="Arial" w:hAnsi="Arial"/>
+          <w:rtl/>
+        </w:rPr>
+        <w:t xml:space="preserve">بوابة المراجع الخارجي عبر الأدوار + قائمة PBC بدورة (طلب←تجهيز←مراجعة)، والنسخ الاحتياطي المشفّر (PBKDF2 + تشفير ثم مصادقة).</w:t>
+      </w:r>
+    </w:p>
+    <w:p>
+      <w:pPr>
+        <w:pStyle w:val="ListParagraph"/>
+        <w:numPr>
+          <w:ilvl w:val="0"/>
+          <w:numId w:val="1"/>
+        </w:numPr>
+        <w:bidi/>
+        <w:spacing w:after="60" w:line="290"/>
+        <w:jc w:val="right"/>
+      </w:pPr>
+      <w:r>
+        <w:rPr>
+          <w:rFonts w:ascii="Arial" w:cs="Arial" w:eastAsia="Arial" w:hAnsi="Arial"/>
+          <w:rtl/>
+        </w:rPr>
+        <w:t xml:space="preserve">سجل الأنشطة (Audit Universe) والخطة السنوية، وملفات المراجعة مع دورة أوراق العمل (إعداد←مراجعة←اعتماد←قفل) والإصدارات، ومحرّك جودة وتحقق البيانات.</w:t>
       </w:r>
     </w:p>
     <w:p>

</xml_diff>